<commit_message>
Add new SVG icons and update index.html to include skill badges for C, SQL, Gemini API, and Zustand
</commit_message>
<xml_diff>
--- a/PORTFOLIO/PORTO CONTENT/Sumit Kumar Resume.docx
+++ b/PORTFOLIO/PORTO CONTENT/Sumit Kumar Resume.docx
@@ -482,148 +482,253 @@
     </w:p>
     <w:p>
       <w:pPr>
-        <w:spacing w:before="80" w:after="40"/>
+        <w:spacing w:before="80" w:after="20"/>
       </w:pPr>
       <w:r>
         <w:rPr>
           <w:rFonts w:ascii="Arial" w:hAnsi="Arial"/>
           <w:b/>
+          <w:color w:val="111827"/>
           <w:sz w:val="21"/>
         </w:rPr>
-        <w:t>LangChain AI Agent POC</w:t>
+        <w:t>AI Problem Analyzer</w:t>
       </w:r>
+    </w:p>
+    <w:p>
+      <w:pPr>
+        <w:spacing w:before="0" w:after="40"/>
+      </w:pPr>
       <w:r>
         <w:rPr>
           <w:rFonts w:ascii="Arial" w:hAnsi="Arial"/>
           <w:i/>
-          <w:sz w:val="19"/>
+          <w:color w:val="374151"/>
+          <w:sz w:val="18"/>
         </w:rPr>
-        <w:t xml:space="preserve">  |  TypeScript, Node.js, LangChain, LangGraph, Google Gemini API</w:t>
+        <w:t>Technologies: React, Node.js, Express.js, Google Gemini API, BullMQ, Redis, MongoDB, Socket.io, TailwindCSS</w:t>
       </w:r>
     </w:p>
     <w:p>
       <w:pPr>
         <w:pStyle w:val="ListBullet"/>
-        <w:spacing w:after="20"/>
+        <w:spacing w:before="20" w:after="60"/>
       </w:pPr>
       <w:r>
-        <w:t>Developed an intelligent agentic POC exploring AI workflows using LangGraph and LangChain JS/TS, leveraging Gemini LLM API, memory layers, and custom tool binding architectures.</w:t>
+        <w:rPr>
+          <w:rFonts w:ascii="Arial" w:hAnsi="Arial"/>
+          <w:color w:val="1F2937"/>
+          <w:sz w:val="19"/>
+        </w:rPr>
+        <w:t>Engineered an intelligent bug analysis and code diagnosis assistant that parses runtime logs and error traces using Google Gemini API, backed by BullMQ/Redis worker pipelines and MongoDB state persistence.</w:t>
       </w:r>
     </w:p>
     <w:p>
       <w:pPr>
-        <w:spacing w:before="80" w:after="40"/>
+        <w:spacing w:before="80" w:after="20"/>
       </w:pPr>
       <w:r>
         <w:rPr>
           <w:rFonts w:ascii="Arial" w:hAnsi="Arial"/>
           <w:b/>
+          <w:color w:val="111827"/>
           <w:sz w:val="21"/>
         </w:rPr>
-        <w:t>Eternal Frames</w:t>
+        <w:t>AI Resume Builder</w:t>
       </w:r>
+    </w:p>
+    <w:p>
+      <w:pPr>
+        <w:spacing w:before="0" w:after="40"/>
+      </w:pPr>
       <w:r>
         <w:rPr>
           <w:rFonts w:ascii="Arial" w:hAnsi="Arial"/>
           <w:i/>
-          <w:sz w:val="19"/>
+          <w:color w:val="374151"/>
+          <w:sz w:val="18"/>
         </w:rPr>
-        <w:t xml:space="preserve">  |  NestJS, TypeScript, TypeORM, PostgreSQL, RabbitMQ, Razorpay, Next.js, Redux Toolkit</w:t>
+        <w:t>Technologies: React, TypeScript, Node.js, Express, Deepgram STT, Gemini API, FFmpeg, BullMQ, Redis, MongoDB, TailwindCSS, Zustand</w:t>
       </w:r>
     </w:p>
     <w:p>
       <w:pPr>
         <w:pStyle w:val="ListBullet"/>
-        <w:spacing w:after="20"/>
+        <w:spacing w:before="20" w:after="60"/>
       </w:pPr>
       <w:r>
+        <w:rPr>
+          <w:rFonts w:ascii="Arial" w:hAnsi="Arial"/>
+          <w:color w:val="1F2937"/>
+          <w:sz w:val="19"/>
+        </w:rPr>
+        <w:t>Engineered an AI profile and resume synthesis platform utilizing FFmpeg to extract audio and Deepgram API (Nova-3 STT) for speech transcription, with Google Gemini API (gemini-1.5-flash) to structure transcriptions into validated JSON profile data, backed by BullMQ/Redis async queues.</w:t>
+      </w:r>
+    </w:p>
+    <w:p>
+      <w:pPr>
+        <w:spacing w:before="80" w:after="20"/>
+      </w:pPr>
+      <w:r>
+        <w:rPr>
+          <w:rFonts w:ascii="Arial" w:hAnsi="Arial"/>
+          <w:b/>
+          <w:color w:val="111827"/>
+          <w:sz w:val="21"/>
+        </w:rPr>
+        <w:t>Deca Chat</w:t>
+      </w:r>
+    </w:p>
+    <w:p>
+      <w:pPr>
+        <w:spacing w:before="0" w:after="40"/>
+      </w:pPr>
+      <w:r>
+        <w:rPr>
+          <w:rFonts w:ascii="Arial" w:hAnsi="Arial"/>
+          <w:i/>
+          <w:color w:val="374151"/>
+          <w:sz w:val="18"/>
+        </w:rPr>
+        <w:t>Technologies: NestJS, WebSockets, Socket.io, TypeORM, PostgreSQL, RabbitMQ, Next.js, Redux Toolkit, Chart.js, TypeScript</w:t>
+      </w:r>
+    </w:p>
+    <w:p>
+      <w:pPr>
+        <w:pStyle w:val="ListBullet"/>
+        <w:spacing w:before="20" w:after="60"/>
+      </w:pPr>
+      <w:r>
+        <w:rPr>
+          <w:rFonts w:ascii="Arial" w:hAnsi="Arial"/>
+          <w:color w:val="1F2937"/>
+          <w:sz w:val="19"/>
+        </w:rPr>
+        <w:t>Architected a real-time multi-room messaging system utilizing NestJS DDD, WebSockets, transactional Inbox-Outbox message synchronization via RabbitMQ, and a weekly chat analytics dashboard.</w:t>
+      </w:r>
+    </w:p>
+    <w:p>
+      <w:pPr>
+        <w:spacing w:before="80" w:after="20"/>
+      </w:pPr>
+      <w:r>
+        <w:rPr>
+          <w:rFonts w:ascii="Arial" w:hAnsi="Arial"/>
+          <w:b/>
+          <w:color w:val="111827"/>
+          <w:sz w:val="21"/>
+        </w:rPr>
+        <w:t>Eternal Frames</w:t>
+      </w:r>
+    </w:p>
+    <w:p>
+      <w:pPr>
+        <w:spacing w:before="0" w:after="40"/>
+      </w:pPr>
+      <w:r>
+        <w:rPr>
+          <w:rFonts w:ascii="Arial" w:hAnsi="Arial"/>
+          <w:i/>
+          <w:color w:val="374151"/>
+          <w:sz w:val="18"/>
+        </w:rPr>
+        <w:t>Technologies: NestJS, TypeScript, TypeORM, PostgreSQL, RabbitMQ, Razorpay, Next.js, Redux Toolkit</w:t>
+      </w:r>
+    </w:p>
+    <w:p>
+      <w:pPr>
+        <w:pStyle w:val="ListBullet"/>
+        <w:spacing w:before="20" w:after="60"/>
+      </w:pPr>
+      <w:r>
+        <w:rPr>
+          <w:rFonts w:ascii="Arial" w:hAnsi="Arial"/>
+          <w:color w:val="1F2937"/>
+          <w:sz w:val="19"/>
+        </w:rPr>
         <w:t>Engineered a multi-tenant event photography gallery &amp; studio management platform featuring subscription tier billing via Razorpay links, modular NestJS DDD architecture, and transactional Outbox messaging with RabbitMQ.</w:t>
       </w:r>
     </w:p>
     <w:p>
       <w:pPr>
-        <w:spacing w:before="80" w:after="40"/>
+        <w:spacing w:before="80" w:after="20"/>
       </w:pPr>
       <w:r>
         <w:rPr>
           <w:rFonts w:ascii="Arial" w:hAnsi="Arial"/>
           <w:b/>
+          <w:color w:val="111827"/>
           <w:sz w:val="21"/>
         </w:rPr>
-        <w:t>Deca Chat</w:t>
+        <w:t>Kanban Management (Zenmonk)</w:t>
       </w:r>
+    </w:p>
+    <w:p>
+      <w:pPr>
+        <w:spacing w:before="0" w:after="40"/>
+      </w:pPr>
       <w:r>
         <w:rPr>
           <w:rFonts w:ascii="Arial" w:hAnsi="Arial"/>
           <w:i/>
-          <w:sz w:val="19"/>
+          <w:color w:val="374151"/>
+          <w:sz w:val="18"/>
         </w:rPr>
-        <w:t xml:space="preserve">  |  NestJS, WebSockets, Socket.io, TypeORM, PostgreSQL, RabbitMQ, Next.js, Redux Toolkit, Chart.js</w:t>
+        <w:t>Technologies: NestJS, TypeScript, TypeORM, PostgreSQL, Socket.io, WebSockets, Next.js, Redux Toolkit, Material UI (MUI), DND Kit, Docker</w:t>
       </w:r>
     </w:p>
     <w:p>
       <w:pPr>
         <w:pStyle w:val="ListBullet"/>
-        <w:spacing w:after="20"/>
+        <w:spacing w:before="20" w:after="60"/>
       </w:pPr>
       <w:r>
-        <w:t>Architected a real-time multi-room messaging system utilizing NestJS DDD, WebSockets, transactional Inbox-Outbox message synchronization via RabbitMQ, and a weekly chat analytics dashboard.</w:t>
+        <w:rPr>
+          <w:rFonts w:ascii="Arial" w:hAnsi="Arial"/>
+          <w:color w:val="1F2937"/>
+          <w:sz w:val="19"/>
+        </w:rPr>
+        <w:t>Developed a real-time collaborative Kanban project board featuring drag-and-drop task tracking via DND Kit, live task status broadcasting through WebSockets/Socket.io, modular NestJS backend with TypeORM migrations, and PostgreSQL relational data storage.</w:t>
       </w:r>
     </w:p>
     <w:p>
       <w:pPr>
-        <w:spacing w:before="80" w:after="40"/>
+        <w:spacing w:before="80" w:after="20"/>
       </w:pPr>
-      <w:r/>
       <w:r>
         <w:rPr>
+          <w:rFonts w:ascii="Arial" w:hAnsi="Arial"/>
           <w:b/>
+          <w:color w:val="111827"/>
+          <w:sz w:val="21"/>
         </w:rPr>
-        <w:t>AI Resume Builder</w:t>
+        <w:t>C++ Custom Web Crawler</w:t>
       </w:r>
+    </w:p>
+    <w:p>
+      <w:pPr>
+        <w:spacing w:before="0" w:after="40"/>
+      </w:pPr>
       <w:r>
         <w:rPr>
+          <w:rFonts w:ascii="Arial" w:hAnsi="Arial"/>
           <w:i/>
+          <w:color w:val="374151"/>
+          <w:sz w:val="18"/>
         </w:rPr>
-        <w:t xml:space="preserve">  |  Node.js, Express, MongoDB, Gemini API, Deepgram STT, FFmpeg, BullMQ, Redis</w:t>
+        <w:t>Technologies: Raw C++, Sockets, Data Structures, Memory Management, Linux</w:t>
       </w:r>
     </w:p>
     <w:p>
       <w:pPr>
         <w:pStyle w:val="ListBullet"/>
-        <w:spacing w:after="20"/>
-      </w:pPr>
-      <w:r>
-        <w:t>Engineered an AI profile and resume synthesis platform utilizing FFmpeg to extract audio and Deepgram API (Nova-3 STT) for speech transcription, with Google Gemini API (gemini-1.5-flash) to structure transcriptions into validated JSON profile data, backed by BullMQ/Redis async queues.</w:t>
-      </w:r>
-    </w:p>
-    <w:p>
-      <w:pPr>
-        <w:spacing w:before="80" w:after="40"/>
+        <w:spacing w:before="20" w:after="60"/>
       </w:pPr>
       <w:r>
         <w:rPr>
           <w:rFonts w:ascii="Arial" w:hAnsi="Arial"/>
-          <w:b/>
-          <w:sz w:val="21"/>
-        </w:rPr>
-        <w:t>C++ Custom Web Crawler</w:t>
-      </w:r>
-      <w:r>
-        <w:rPr>
-          <w:rFonts w:ascii="Arial" w:hAnsi="Arial"/>
-          <w:i/>
+          <w:color w:val="1F2937"/>
           <w:sz w:val="19"/>
         </w:rPr>
-        <w:t xml:space="preserve">  |  Raw C++, Sockets, Data Structures, Memory Management</w:t>
-      </w:r>
-    </w:p>
-    <w:p>
-      <w:pPr>
-        <w:pStyle w:val="ListBullet"/>
-        <w:spacing w:after="20"/>
-      </w:pPr>
-      <w:r>
         <w:t>Built a web crawler in raw C++ using custom generic string, linked list, and hashmap libraries — completely avoiding external dependencies or standard string methods.</w:t>
       </w:r>
     </w:p>

</xml_diff>

<commit_message>
Update resume files to include latest changes in format and content
</commit_message>
<xml_diff>
--- a/PORTFOLIO/PORTO CONTENT/Sumit Kumar Resume.docx
+++ b/PORTFOLIO/PORTO CONTENT/Sumit Kumar Resume.docx
@@ -482,252 +482,204 @@
     </w:p>
     <w:p>
       <w:pPr>
-        <w:spacing w:before="80" w:after="20"/>
+        <w:spacing w:before="80" w:after="40"/>
       </w:pPr>
       <w:r>
         <w:rPr>
           <w:rFonts w:ascii="Arial" w:hAnsi="Arial"/>
           <w:b/>
-          <w:color w:val="111827"/>
           <w:sz w:val="21"/>
         </w:rPr>
         <w:t>AI Problem Analyzer</w:t>
       </w:r>
-    </w:p>
-    <w:p>
-      <w:pPr>
-        <w:spacing w:before="0" w:after="40"/>
-      </w:pPr>
       <w:r>
         <w:rPr>
           <w:rFonts w:ascii="Arial" w:hAnsi="Arial"/>
           <w:i/>
-          <w:color w:val="374151"/>
-          <w:sz w:val="18"/>
+          <w:sz w:val="19"/>
         </w:rPr>
-        <w:t>Technologies: React, Node.js, Express.js, Google Gemini API, BullMQ, Redis, MongoDB, Socket.io, TailwindCSS</w:t>
+        <w:t xml:space="preserve">  |  React, Node.js, Express.js, Google Gemini API, BullMQ, Redis, MongoDB, Socket.io, TailwindCSS</w:t>
       </w:r>
     </w:p>
     <w:p>
       <w:pPr>
         <w:pStyle w:val="ListBullet"/>
-        <w:spacing w:before="20" w:after="60"/>
+        <w:spacing w:after="20"/>
       </w:pPr>
       <w:r>
         <w:rPr>
           <w:rFonts w:ascii="Arial" w:hAnsi="Arial"/>
-          <w:color w:val="1F2937"/>
-          <w:sz w:val="19"/>
+          <w:sz w:val="20"/>
         </w:rPr>
         <w:t>Engineered an intelligent bug analysis and code diagnosis assistant that parses runtime logs and error traces using Google Gemini API, backed by BullMQ/Redis worker pipelines and MongoDB state persistence.</w:t>
       </w:r>
     </w:p>
     <w:p>
       <w:pPr>
-        <w:spacing w:before="80" w:after="20"/>
+        <w:spacing w:before="80" w:after="40"/>
       </w:pPr>
       <w:r>
         <w:rPr>
           <w:rFonts w:ascii="Arial" w:hAnsi="Arial"/>
           <w:b/>
-          <w:color w:val="111827"/>
           <w:sz w:val="21"/>
         </w:rPr>
         <w:t>AI Resume Builder</w:t>
       </w:r>
-    </w:p>
-    <w:p>
-      <w:pPr>
-        <w:spacing w:before="0" w:after="40"/>
-      </w:pPr>
       <w:r>
         <w:rPr>
           <w:rFonts w:ascii="Arial" w:hAnsi="Arial"/>
           <w:i/>
-          <w:color w:val="374151"/>
-          <w:sz w:val="18"/>
+          <w:sz w:val="19"/>
         </w:rPr>
-        <w:t>Technologies: React, TypeScript, Node.js, Express, Deepgram STT, Gemini API, FFmpeg, BullMQ, Redis, MongoDB, TailwindCSS, Zustand</w:t>
+        <w:t xml:space="preserve">  |  React, TypeScript, Node.js, Express, Deepgram STT, Gemini API, FFmpeg, BullMQ, Redis, MongoDB, TailwindCSS, Zustand</w:t>
       </w:r>
     </w:p>
     <w:p>
       <w:pPr>
         <w:pStyle w:val="ListBullet"/>
-        <w:spacing w:before="20" w:after="60"/>
+        <w:spacing w:after="20"/>
       </w:pPr>
       <w:r>
         <w:rPr>
           <w:rFonts w:ascii="Arial" w:hAnsi="Arial"/>
-          <w:color w:val="1F2937"/>
-          <w:sz w:val="19"/>
+          <w:sz w:val="20"/>
         </w:rPr>
         <w:t>Engineered an AI profile and resume synthesis platform utilizing FFmpeg to extract audio and Deepgram API (Nova-3 STT) for speech transcription, with Google Gemini API (gemini-1.5-flash) to structure transcriptions into validated JSON profile data, backed by BullMQ/Redis async queues.</w:t>
       </w:r>
     </w:p>
     <w:p>
       <w:pPr>
-        <w:spacing w:before="80" w:after="20"/>
+        <w:spacing w:before="80" w:after="40"/>
       </w:pPr>
       <w:r>
         <w:rPr>
           <w:rFonts w:ascii="Arial" w:hAnsi="Arial"/>
           <w:b/>
-          <w:color w:val="111827"/>
           <w:sz w:val="21"/>
         </w:rPr>
         <w:t>Deca Chat</w:t>
       </w:r>
-    </w:p>
-    <w:p>
-      <w:pPr>
-        <w:spacing w:before="0" w:after="40"/>
-      </w:pPr>
       <w:r>
         <w:rPr>
           <w:rFonts w:ascii="Arial" w:hAnsi="Arial"/>
           <w:i/>
-          <w:color w:val="374151"/>
-          <w:sz w:val="18"/>
+          <w:sz w:val="19"/>
         </w:rPr>
-        <w:t>Technologies: NestJS, WebSockets, Socket.io, TypeORM, PostgreSQL, RabbitMQ, Next.js, Redux Toolkit, Chart.js, TypeScript</w:t>
+        <w:t xml:space="preserve">  |  NestJS, WebSockets, Socket.io, TypeORM, PostgreSQL, RabbitMQ, Next.js, Redux Toolkit, Chart.js, TypeScript</w:t>
       </w:r>
     </w:p>
     <w:p>
       <w:pPr>
         <w:pStyle w:val="ListBullet"/>
-        <w:spacing w:before="20" w:after="60"/>
+        <w:spacing w:after="20"/>
       </w:pPr>
       <w:r>
         <w:rPr>
           <w:rFonts w:ascii="Arial" w:hAnsi="Arial"/>
-          <w:color w:val="1F2937"/>
-          <w:sz w:val="19"/>
+          <w:sz w:val="20"/>
         </w:rPr>
         <w:t>Architected a real-time multi-room messaging system utilizing NestJS DDD, WebSockets, transactional Inbox-Outbox message synchronization via RabbitMQ, and a weekly chat analytics dashboard.</w:t>
       </w:r>
     </w:p>
     <w:p>
       <w:pPr>
-        <w:spacing w:before="80" w:after="20"/>
+        <w:spacing w:before="80" w:after="40"/>
       </w:pPr>
       <w:r>
         <w:rPr>
           <w:rFonts w:ascii="Arial" w:hAnsi="Arial"/>
           <w:b/>
-          <w:color w:val="111827"/>
           <w:sz w:val="21"/>
         </w:rPr>
         <w:t>Eternal Frames</w:t>
       </w:r>
-    </w:p>
-    <w:p>
-      <w:pPr>
-        <w:spacing w:before="0" w:after="40"/>
-      </w:pPr>
       <w:r>
         <w:rPr>
           <w:rFonts w:ascii="Arial" w:hAnsi="Arial"/>
           <w:i/>
-          <w:color w:val="374151"/>
-          <w:sz w:val="18"/>
+          <w:sz w:val="19"/>
         </w:rPr>
-        <w:t>Technologies: NestJS, TypeScript, TypeORM, PostgreSQL, RabbitMQ, Razorpay, Next.js, Redux Toolkit</w:t>
+        <w:t xml:space="preserve">  |  NestJS, TypeScript, TypeORM, PostgreSQL, RabbitMQ, Razorpay, Next.js, Redux Toolkit</w:t>
       </w:r>
     </w:p>
     <w:p>
       <w:pPr>
         <w:pStyle w:val="ListBullet"/>
-        <w:spacing w:before="20" w:after="60"/>
+        <w:spacing w:after="20"/>
       </w:pPr>
       <w:r>
         <w:rPr>
           <w:rFonts w:ascii="Arial" w:hAnsi="Arial"/>
-          <w:color w:val="1F2937"/>
-          <w:sz w:val="19"/>
+          <w:sz w:val="20"/>
         </w:rPr>
         <w:t>Engineered a multi-tenant event photography gallery &amp; studio management platform featuring subscription tier billing via Razorpay links, modular NestJS DDD architecture, and transactional Outbox messaging with RabbitMQ.</w:t>
       </w:r>
     </w:p>
     <w:p>
       <w:pPr>
-        <w:spacing w:before="80" w:after="20"/>
+        <w:spacing w:before="80" w:after="40"/>
       </w:pPr>
       <w:r>
         <w:rPr>
           <w:rFonts w:ascii="Arial" w:hAnsi="Arial"/>
           <w:b/>
-          <w:color w:val="111827"/>
           <w:sz w:val="21"/>
         </w:rPr>
         <w:t>Kanban Management (Zenmonk)</w:t>
       </w:r>
-    </w:p>
-    <w:p>
-      <w:pPr>
-        <w:spacing w:before="0" w:after="40"/>
-      </w:pPr>
       <w:r>
         <w:rPr>
           <w:rFonts w:ascii="Arial" w:hAnsi="Arial"/>
           <w:i/>
-          <w:color w:val="374151"/>
-          <w:sz w:val="18"/>
+          <w:sz w:val="19"/>
         </w:rPr>
-        <w:t>Technologies: NestJS, TypeScript, TypeORM, PostgreSQL, Socket.io, WebSockets, Next.js, Redux Toolkit, Material UI (MUI), DND Kit, Docker</w:t>
+        <w:t xml:space="preserve">  |  NestJS, TypeScript, TypeORM, PostgreSQL, Socket.io, WebSockets, Next.js, Redux Toolkit, Material UI (MUI), DND Kit, Docker</w:t>
       </w:r>
     </w:p>
     <w:p>
       <w:pPr>
         <w:pStyle w:val="ListBullet"/>
-        <w:spacing w:before="20" w:after="60"/>
+        <w:spacing w:after="20"/>
       </w:pPr>
       <w:r>
         <w:rPr>
           <w:rFonts w:ascii="Arial" w:hAnsi="Arial"/>
-          <w:color w:val="1F2937"/>
-          <w:sz w:val="19"/>
+          <w:sz w:val="20"/>
         </w:rPr>
         <w:t>Developed a real-time collaborative Kanban project board featuring drag-and-drop task tracking via DND Kit, live task status broadcasting through WebSockets/Socket.io, modular NestJS backend with TypeORM migrations, and PostgreSQL relational data storage.</w:t>
       </w:r>
     </w:p>
     <w:p>
       <w:pPr>
-        <w:spacing w:before="80" w:after="20"/>
+        <w:spacing w:before="80" w:after="40"/>
       </w:pPr>
       <w:r>
         <w:rPr>
           <w:rFonts w:ascii="Arial" w:hAnsi="Arial"/>
           <w:b/>
-          <w:color w:val="111827"/>
           <w:sz w:val="21"/>
         </w:rPr>
         <w:t>C++ Custom Web Crawler</w:t>
       </w:r>
-    </w:p>
-    <w:p>
-      <w:pPr>
-        <w:spacing w:before="0" w:after="40"/>
-      </w:pPr>
       <w:r>
         <w:rPr>
           <w:rFonts w:ascii="Arial" w:hAnsi="Arial"/>
           <w:i/>
-          <w:color w:val="374151"/>
-          <w:sz w:val="18"/>
+          <w:sz w:val="19"/>
         </w:rPr>
-        <w:t>Technologies: Raw C++, Sockets, Data Structures, Memory Management, Linux</w:t>
+        <w:t xml:space="preserve">  |  Raw C++, Sockets, Data Structures, Memory Management, Linux</w:t>
       </w:r>
     </w:p>
     <w:p>
       <w:pPr>
         <w:pStyle w:val="ListBullet"/>
-        <w:spacing w:before="20" w:after="60"/>
+        <w:spacing w:after="20"/>
       </w:pPr>
       <w:r>
         <w:rPr>
           <w:rFonts w:ascii="Arial" w:hAnsi="Arial"/>
-          <w:color w:val="1F2937"/>
-          <w:sz w:val="19"/>
+          <w:sz w:val="20"/>
         </w:rPr>
         <w:t>Built a web crawler in raw C++ using custom generic string, linked list, and hashmap libraries — completely avoiding external dependencies or standard string methods.</w:t>
       </w:r>

</xml_diff>

<commit_message>
fix graduation passing year in html and resume both and updated some css of experience git header
</commit_message>
<xml_diff>
--- a/PORTFOLIO/PORTO CONTENT/Sumit Kumar Resume.docx
+++ b/PORTFOLIO/PORTO CONTENT/Sumit Kumar Resume.docx
@@ -270,7 +270,7 @@
           <w:rFonts w:ascii="Arial" w:hAnsi="Arial"/>
           <w:sz w:val="21"/>
         </w:rPr>
-        <w:t xml:space="preserve">  |  Full Stack Developer  |  </w:t>
+        <w:t xml:space="preserve">  |  Full Stack Developer Intern  |  </w:t>
       </w:r>
       <w:r>
         <w:rPr>
@@ -781,7 +781,7 @@
           <w:b/>
           <w:sz w:val="20"/>
         </w:rPr>
-        <w:t>2021 – 2025  |  CGPA: 7.5</w:t>
+        <w:t>2022 – 2025  |  CGPA: 7.5</w:t>
       </w:r>
     </w:p>
     <w:p>

</xml_diff>

<commit_message>
techbuilder removed and projects updated
</commit_message>
<xml_diff>
--- a/PORTFOLIO/PORTO CONTENT/Sumit Kumar Resume.docx
+++ b/PORTFOLIO/PORTO CONTENT/Sumit Kumar Resume.docx
@@ -289,7 +289,7 @@
           <w:b/>
           <w:sz w:val="21"/>
         </w:rPr>
-        <w:t>Feb 2026 – Present</w:t>
+        <w:t>Nov 2025 – Present</w:t>
       </w:r>
     </w:p>
     <w:p>
@@ -316,7 +316,7 @@
         <w:spacing w:after="20"/>
       </w:pPr>
       <w:r>
-        <w:t>Applied Domain-Driven Design (DDD) and CQRS patterns to build maintainable, decoupled core application modules.</w:t>
+        <w:t>Integrated PayMongo and GWallet payment gateways and architected Stripe Connected Accounts for vendor onboarding, automated payouts, and idempotent webhook flows.</w:t>
       </w:r>
     </w:p>
     <w:p>
@@ -325,49 +325,7 @@
         <w:spacing w:after="20"/>
       </w:pPr>
       <w:r>
-        <w:t>Participated in agile peer code reviews, automated route testing with Postman, and schema validation with Zod.</w:t>
-      </w:r>
-    </w:p>
-    <w:p>
-      <w:pPr>
-        <w:tabs>
-          <w:tab w:pos="10800" w:val="right"/>
-        </w:tabs>
-        <w:spacing w:before="80" w:after="40"/>
-      </w:pPr>
-      <w:r>
-        <w:rPr>
-          <w:rFonts w:ascii="Arial" w:hAnsi="Arial"/>
-          <w:b/>
-          <w:sz w:val="21"/>
-        </w:rPr>
-        <w:t>Techbuilder</w:t>
-      </w:r>
-      <w:r>
-        <w:rPr>
-          <w:rFonts w:ascii="Arial" w:hAnsi="Arial"/>
-          <w:sz w:val="21"/>
-        </w:rPr>
-        <w:t xml:space="preserve">  |  Node.js Developer Intern  |  </w:t>
-      </w:r>
-      <w:r>
-        <w:rPr>
-          <w:rFonts w:ascii="Arial" w:hAnsi="Arial"/>
-          <w:i/>
-          <w:sz w:val="21"/>
-        </w:rPr>
-        <w:t>Mohali, India</w:t>
-      </w:r>
-      <w:r>
-        <w:tab/>
-      </w:r>
-      <w:r>
-        <w:rPr>
-          <w:rFonts w:ascii="Arial" w:hAnsi="Arial"/>
-          <w:b/>
-          <w:sz w:val="21"/>
-        </w:rPr>
-        <w:t>Nov 2025 – Feb 2026</w:t>
+        <w:t>Applied Domain-Driven Design (DDD) and CQRS patterns, optimizing high-concurrency order dispatch routes and real-time backend microservices.</w:t>
       </w:r>
     </w:p>
     <w:p>
@@ -376,34 +334,7 @@
         <w:spacing w:after="20"/>
       </w:pPr>
       <w:r>
-        <w:t>Maintained scalable backend services in Node.js for a ride &amp; food delivery platform (mobile app + web dashboard), supporting real-time orders.</w:t>
-      </w:r>
-    </w:p>
-    <w:p>
-      <w:pPr>
-        <w:pStyle w:val="ListBullet"/>
-        <w:spacing w:after="20"/>
-      </w:pPr>
-      <w:r>
-        <w:t>Integrated PayMongo and GWallet (Philippines) payment gateways and architected Stripe Connected Accounts for vendor/driver onboarding and automated payouts.</w:t>
-      </w:r>
-    </w:p>
-    <w:p>
-      <w:pPr>
-        <w:pStyle w:val="ListBullet"/>
-        <w:spacing w:after="20"/>
-      </w:pPr>
-      <w:r>
-        <w:t>Designed webhook-driven payment flows.</w:t>
-      </w:r>
-    </w:p>
-    <w:p>
-      <w:pPr>
-        <w:pStyle w:val="ListBullet"/>
-        <w:spacing w:after="20"/>
-      </w:pPr>
-      <w:r>
-        <w:t>Worked extensively with Git and GitHub (feature branches, pull requests, code reviews, merge conflict resolution) to ensure clean collaboration and stable production releases.</w:t>
+        <w:t>Participated in agile peer code reviews, Git feature branch workflows, automated route testing with Postman, and schema validation with Zod.</w:t>
       </w:r>
     </w:p>
     <w:p>
@@ -445,7 +376,7 @@
           <w:b/>
           <w:sz w:val="21"/>
         </w:rPr>
-        <w:t>Feb 2025 – Nov 2025</w:t>
+        <w:t>Feb 2025 – Oct 2025</w:t>
       </w:r>
     </w:p>
     <w:p>
@@ -481,6 +412,38 @@
       </w:r>
     </w:p>
     <w:p>
+      <w:pPr/>
+      <w:r>
+        <w:rPr>
+          <w:rFonts w:ascii="Arial" w:hAnsi="Arial"/>
+          <w:b/>
+          <w:sz w:val="21"/>
+        </w:rPr>
+        <w:t>Multi-Tenant Platform (Rides, Delivery &amp; Rentals)</w:t>
+      </w:r>
+      <w:r>
+        <w:rPr>
+          <w:rFonts w:ascii="Arial" w:hAnsi="Arial"/>
+          <w:b w:val="0"/>
+          <w:sz w:val="19"/>
+        </w:rPr>
+        <w:t xml:space="preserve">  |  Node.js, Express.js, Stripe Connect, PayMongo API, Webhooks, REST APIs</w:t>
+      </w:r>
+    </w:p>
+    <w:p>
+      <w:pPr>
+        <w:pStyle w:val="ListBullet"/>
+      </w:pPr>
+      <w:r>
+        <w:rPr>
+          <w:rFonts w:ascii="Arial" w:hAnsi="Arial"/>
+          <w:b w:val="0"/>
+          <w:sz w:val="20"/>
+        </w:rPr>
+        <w:t>Architected multi-tenant backend services for unified ride-sharing, food delivery, and vehicle rentals; integrated PayMongo and Stripe Connected Accounts for automated driver/vendor payouts, built idempotent webhook listeners, and resolved API &amp; backend-contract bottlenecks for frontend and iOS teams.</w:t>
+      </w:r>
+    </w:p>
+    <w:p>
       <w:pPr>
         <w:spacing w:before="80" w:after="40"/>
       </w:pPr>
@@ -512,74 +475,6 @@
           <w:sz w:val="20"/>
         </w:rPr>
         <w:t>Engineered an intelligent bug analysis and code diagnosis assistant that parses runtime logs and error traces using Google Gemini API, backed by BullMQ/Redis worker pipelines and MongoDB state persistence.</w:t>
-      </w:r>
-    </w:p>
-    <w:p>
-      <w:pPr>
-        <w:spacing w:before="80" w:after="40"/>
-      </w:pPr>
-      <w:r>
-        <w:rPr>
-          <w:rFonts w:ascii="Arial" w:hAnsi="Arial"/>
-          <w:b/>
-          <w:sz w:val="21"/>
-        </w:rPr>
-        <w:t>AI Resume Builder</w:t>
-      </w:r>
-      <w:r>
-        <w:rPr>
-          <w:rFonts w:ascii="Arial" w:hAnsi="Arial"/>
-          <w:i/>
-          <w:sz w:val="19"/>
-        </w:rPr>
-        <w:t xml:space="preserve">  |  React, TypeScript, Node.js, Express, Deepgram STT, Gemini API, FFmpeg, BullMQ, Redis, MongoDB, TailwindCSS, Zustand</w:t>
-      </w:r>
-    </w:p>
-    <w:p>
-      <w:pPr>
-        <w:pStyle w:val="ListBullet"/>
-        <w:spacing w:after="20"/>
-      </w:pPr>
-      <w:r>
-        <w:rPr>
-          <w:rFonts w:ascii="Arial" w:hAnsi="Arial"/>
-          <w:sz w:val="20"/>
-        </w:rPr>
-        <w:t>Engineered an AI profile and resume synthesis platform utilizing FFmpeg to extract audio and Deepgram API (Nova-3 STT) for speech transcription, with Google Gemini API (gemini-1.5-flash) to structure transcriptions into validated JSON profile data, backed by BullMQ/Redis async queues.</w:t>
-      </w:r>
-    </w:p>
-    <w:p>
-      <w:pPr>
-        <w:spacing w:before="80" w:after="40"/>
-      </w:pPr>
-      <w:r>
-        <w:rPr>
-          <w:rFonts w:ascii="Arial" w:hAnsi="Arial"/>
-          <w:b/>
-          <w:sz w:val="21"/>
-        </w:rPr>
-        <w:t>Deca Chat</w:t>
-      </w:r>
-      <w:r>
-        <w:rPr>
-          <w:rFonts w:ascii="Arial" w:hAnsi="Arial"/>
-          <w:i/>
-          <w:sz w:val="19"/>
-        </w:rPr>
-        <w:t xml:space="preserve">  |  NestJS, WebSockets, Socket.io, TypeORM, PostgreSQL, RabbitMQ, Next.js, Redux Toolkit, Chart.js, TypeScript</w:t>
-      </w:r>
-    </w:p>
-    <w:p>
-      <w:pPr>
-        <w:pStyle w:val="ListBullet"/>
-        <w:spacing w:after="20"/>
-      </w:pPr>
-      <w:r>
-        <w:rPr>
-          <w:rFonts w:ascii="Arial" w:hAnsi="Arial"/>
-          <w:sz w:val="20"/>
-        </w:rPr>
-        <w:t>Architected a real-time multi-room messaging system utilizing NestJS DDD, WebSockets, transactional Inbox-Outbox message synchronization via RabbitMQ, and a weekly chat analytics dashboard.</w:t>
       </w:r>
     </w:p>
     <w:p>
@@ -648,40 +543,6 @@
           <w:sz w:val="20"/>
         </w:rPr>
         <w:t>Developed a real-time collaborative Kanban project board featuring drag-and-drop task tracking via DND Kit, live task status broadcasting through WebSockets/Socket.io, modular NestJS backend with TypeORM migrations, and PostgreSQL relational data storage.</w:t>
-      </w:r>
-    </w:p>
-    <w:p>
-      <w:pPr>
-        <w:spacing w:before="80" w:after="40"/>
-      </w:pPr>
-      <w:r>
-        <w:rPr>
-          <w:rFonts w:ascii="Arial" w:hAnsi="Arial"/>
-          <w:b/>
-          <w:sz w:val="21"/>
-        </w:rPr>
-        <w:t>C++ Custom Web Crawler</w:t>
-      </w:r>
-      <w:r>
-        <w:rPr>
-          <w:rFonts w:ascii="Arial" w:hAnsi="Arial"/>
-          <w:i/>
-          <w:sz w:val="19"/>
-        </w:rPr>
-        <w:t xml:space="preserve">  |  Raw C++, Sockets, Data Structures, Memory Management, Linux</w:t>
-      </w:r>
-    </w:p>
-    <w:p>
-      <w:pPr>
-        <w:pStyle w:val="ListBullet"/>
-        <w:spacing w:after="20"/>
-      </w:pPr>
-      <w:r>
-        <w:rPr>
-          <w:rFonts w:ascii="Arial" w:hAnsi="Arial"/>
-          <w:sz w:val="20"/>
-        </w:rPr>
-        <w:t>Built a web crawler in raw C++ using custom generic string, linked list, and hashmap libraries — completely avoiding external dependencies or standard string methods.</w:t>
       </w:r>
     </w:p>
     <w:p>
@@ -782,92 +643,6 @@
           <w:sz w:val="20"/>
         </w:rPr>
         <w:t>2022 – 2025  |  CGPA: 7.5</w:t>
-      </w:r>
-    </w:p>
-    <w:p>
-      <w:pPr>
-        <w:tabs>
-          <w:tab w:pos="10642" w:val="right"/>
-        </w:tabs>
-        <w:spacing w:after="60"/>
-        <w:ind w:left="158" w:right="158"/>
-      </w:pPr>
-      <w:r>
-        <w:rPr>
-          <w:rFonts w:ascii="Arial" w:hAnsi="Arial"/>
-          <w:b/>
-          <w:sz w:val="20"/>
-        </w:rPr>
-        <w:t>Class 12 (Senior Secondary)</w:t>
-      </w:r>
-      <w:r>
-        <w:rPr>
-          <w:rFonts w:ascii="Arial" w:hAnsi="Arial"/>
-          <w:sz w:val="20"/>
-        </w:rPr>
-        <w:t xml:space="preserve">  |  </w:t>
-      </w:r>
-      <w:r>
-        <w:rPr>
-          <w:rFonts w:ascii="Arial" w:hAnsi="Arial"/>
-          <w:i/>
-          <w:sz w:val="20"/>
-        </w:rPr>
-        <w:t>Arya Sr. Sec. School, Panipat</w:t>
-      </w:r>
-      <w:r>
-        <w:tab/>
-      </w:r>
-      <w:r>
-        <w:rPr>
-          <w:rFonts w:ascii="Arial" w:hAnsi="Arial"/>
-          <w:b/>
-          <w:sz w:val="20"/>
-        </w:rPr>
-        <w:t>2021</w:t>
-      </w:r>
-    </w:p>
-    <w:p>
-      <w:pPr>
-        <w:tabs>
-          <w:tab w:pos="10642" w:val="right"/>
-        </w:tabs>
-        <w:spacing w:after="60"/>
-        <w:ind w:left="158" w:right="158"/>
-      </w:pPr>
-      <w:r>
-        <w:rPr>
-          <w:rFonts w:ascii="Arial" w:hAnsi="Arial"/>
-          <w:b/>
-          <w:sz w:val="20"/>
-        </w:rPr>
-        <w:t>Class 10 (High School)</w:t>
-      </w:r>
-      <w:r>
-        <w:rPr>
-          <w:rFonts w:ascii="Arial" w:hAnsi="Arial"/>
-          <w:sz w:val="20"/>
-        </w:rPr>
-        <w:t xml:space="preserve">  |  </w:t>
-      </w:r>
-      <w:r>
-        <w:rPr>
-          <w:rFonts w:ascii="Arial" w:hAnsi="Arial"/>
-          <w:i/>
-          <w:sz w:val="20"/>
-        </w:rPr>
-        <w:t>Arya Sr. Sec. School, Panipat</w:t>
-      </w:r>
-      <w:r>
-        <w:tab/>
-      </w:r>
-      <w:r>
-        <w:rPr>
-          <w:rFonts w:ascii="Arial" w:hAnsi="Arial"/>
-          <w:b/>
-          <w:sz w:val="20"/>
-        </w:rPr>
-        <w:t>2019</w:t>
       </w:r>
     </w:p>
     <w:p>

</xml_diff>